<commit_message>
CAN adapter USB detection issue debug story
</commit_message>
<xml_diff>
--- a/Debug.docx
+++ b/Debug.docx
@@ -26,15 +26,7 @@
         <w:t>and</w:t>
       </w:r>
       <w:r>
-        <w:t xml:space="preserve"> supported multiple diagnostic services such as reading gain values, calibration parameters, and sensor min/max limits. These services followed a request-response mechanism </w:t>
-      </w:r>
-      <w:proofErr w:type="gramStart"/>
-      <w:r>
-        <w:t>similar to</w:t>
-      </w:r>
-      <w:proofErr w:type="gramEnd"/>
-      <w:r>
-        <w:t xml:space="preserve"> UDS and were implemented using CAN ISO-TP. A Python-based diagnostic tool connected through a PCAN interface was used to send requests and receive responses from the handbrake PCB.</w:t>
+        <w:t xml:space="preserve"> supported multiple diagnostic services such as reading gain values, calibration parameters, and sensor min/max limits. These services followed a request-response mechanism similar to UDS and were implemented using CAN ISO-TP. A Python-based diagnostic tool connected through a PCAN interface was used to send requests and receive responses from the handbrake PCB.</w:t>
       </w:r>
     </w:p>
     <w:p>
@@ -58,15 +50,7 @@
         </w:numPr>
       </w:pPr>
       <w:r>
-        <w:t xml:space="preserve">The most interesting observation was that the issue disappeared whenever debug prints were enabled. With debug logging </w:t>
-      </w:r>
-      <w:proofErr w:type="gramStart"/>
-      <w:r>
-        <w:t>active</w:t>
-      </w:r>
-      <w:proofErr w:type="gramEnd"/>
-      <w:r>
-        <w:t>, all diagnostic services worked correctly, but after removing the logs for release preparation, the failure consistently reappeared. This immediately suggested that the problem was not in the service implementation itself, but rather a timing-sensitive issue that was being masked by the delays introduced by debug logging.</w:t>
+        <w:t>The most interesting observation was that the issue disappeared whenever debug prints were enabled. With debug logging active, all diagnostic services worked correctly, but after removing the logs for release preparation, the failure consistently reappeared. This immediately suggested that the problem was not in the service implementation itself, but rather a timing-sensitive issue that was being masked by the delays introduced by debug logging.</w:t>
       </w:r>
     </w:p>
     <w:p>
@@ -124,15 +108,7 @@
     </w:p>
     <w:p>
       <w:r>
-        <w:t xml:space="preserve">Since software debugging options were limited, I shifted my focus to protocol-level analysis. I connected a logic analyzer to the SPI lines between the wheelbase and motor and captured the </w:t>
-      </w:r>
-      <w:proofErr w:type="gramStart"/>
-      <w:r>
-        <w:t>communication traffic</w:t>
-      </w:r>
-      <w:proofErr w:type="gramEnd"/>
-      <w:r>
-        <w:t>. By analyzing the SPI timing, I discovered that the wheelbase, acting as the master, was requesting data from the motor approximately every 375 microseconds. However, after a recent feature update, an additional 16 bytes of data had been added to the communication payload. The motor firmware now required significantly more processing time to prepare the response data, but the wheelbase request interval had not been updated to account for the increased payload size.</w:t>
+        <w:t>Since software debugging options were limited, I shifted my focus to protocol-level analysis. I connected a logic analyzer to the SPI lines between the wheelbase and motor and captured the communication traffic. By analyzing the SPI timing, I discovered that the wheelbase, acting as the master, was requesting data from the motor approximately every 375 microseconds. However, after a recent feature update, an additional 16 bytes of data had been added to the communication payload. The motor firmware now required significantly more processing time to prepare the response data, but the wheelbase request interval had not been updated to account for the increased payload size.</w:t>
       </w:r>
     </w:p>
     <w:p>
@@ -152,6 +128,27 @@
       </w:r>
     </w:p>
     <w:p/>
+    <w:p/>
+    <w:p>
+      <w:pPr>
+        <w:pStyle w:val="Mysubhead1"/>
+        <w:jc w:val="center"/>
+      </w:pPr>
+      <w:r>
+        <w:t>CAN Adapter USB Detection Issue – Debug Story</w:t>
+      </w:r>
+    </w:p>
+    <w:p>
+      <w:pPr>
+        <w:pStyle w:val="Mysubhead1"/>
+        <w:jc w:val="center"/>
+      </w:pPr>
+    </w:p>
+    <w:p>
+      <w:r>
+        <w:t>"I was validating a new CAN Adapter prototype that received pedal and handbrake data through UART and exposed them to a PC through USB Type-C. The pedal and handbrake data were being received correctly, but the device was not consistently detected by the Fanatec application. Initially, I investigated the firmware side by checking USB initialization, descriptors, VID/PID, and HID report generation, but everything looked correct. The issue was intermittent, which made debugging difficult. After repeated testing, I noticed that the device was detected only when the USB Type-C cable was inserted in one orientation. When the cable was flipped, detection failed. This observation indicated the issue was likely hardware-related rather than firmware-related. I worked with the hardware team, and they found a USB Type-C orientation handling issue in the hardware design, likely around the CC pin circuitry. After the hardware fix, USB detection became stable in both orientations. The key lesson was that successful debugging requires looking at the complete system and not assuming every problem originates from firmware."</w:t>
+      </w:r>
+    </w:p>
     <w:sectPr>
       <w:pgSz w:w="12240" w:h="15840"/>
       <w:pgMar w:top="1440" w:right="1440" w:bottom="1440" w:left="1440" w:header="720" w:footer="720" w:gutter="0"/>
@@ -165,6 +162,602 @@
 <file path=word/numbering.xml><?xml version="1.0" encoding="utf-8"?>
 <w:numbering xmlns:wpc="http://schemas.microsoft.com/office/word/2010/wordprocessingCanvas" xmlns:cx="http://schemas.microsoft.com/office/drawing/2014/chartex" xmlns:cx1="http://schemas.microsoft.com/office/drawing/2015/9/8/chartex" xmlns:cx2="http://schemas.microsoft.com/office/drawing/2015/10/21/chartex" xmlns:cx3="http://schemas.microsoft.com/office/drawing/2016/5/9/chartex" xmlns:cx4="http://schemas.microsoft.com/office/drawing/2016/5/10/chartex" xmlns:cx5="http://schemas.microsoft.com/office/drawing/2016/5/11/chartex" xmlns:cx6="http://schemas.microsoft.com/office/drawing/2016/5/12/chartex" xmlns:cx7="http://schemas.microsoft.com/office/drawing/2016/5/13/chartex" xmlns:cx8="http://schemas.microsoft.com/office/drawing/2016/5/14/chartex" xmlns:mc="http://schemas.openxmlformats.org/markup-compatibility/2006" xmlns:aink="http://schemas.microsoft.com/office/drawing/2016/ink" xmlns:am3d="http://schemas.microsoft.com/office/drawing/2017/model3d" xmlns:o="urn:schemas-microsoft-com:office:office" xmlns:oel="http://schemas.microsoft.com/office/2019/extlst" xmlns:r="http://schemas.openxmlformats.org/officeDocument/2006/relationships" xmlns:m="http://schemas.openxmlformats.org/officeDocument/2006/math" xmlns:v="urn:schemas-microsoft-com:vml" xmlns:wp14="http://schemas.microsoft.com/office/word/2010/wordprocessingDrawing" xmlns:wp="http://schemas.openxmlformats.org/drawingml/2006/wordprocessingDrawing" xmlns:w10="urn:schemas-microsoft-com:office:word" xmlns:w="http://schemas.openxmlformats.org/wordprocessingml/2006/main" xmlns:w14="http://schemas.microsoft.com/office/word/2010/wordml" xmlns:w15="http://schemas.microsoft.com/office/word/2012/wordml" xmlns:w16cex="http://schemas.microsoft.com/office/word/2018/wordml/cex" xmlns:w16cid="http://schemas.microsoft.com/office/word/2016/wordml/cid" xmlns:w16="http://schemas.microsoft.com/office/word/2018/wordml" xmlns:w16du="http://schemas.microsoft.com/office/word/2023/wordml/word16du" xmlns:w16sdtdh="http://schemas.microsoft.com/office/word/2020/wordml/sdtdatahash" xmlns:w16sdtfl="http://schemas.microsoft.com/office/word/2024/wordml/sdtformatlock" xmlns:w16se="http://schemas.microsoft.com/office/word/2015/wordml/symex" xmlns:wpg="http://schemas.microsoft.com/office/word/2010/wordprocessingGroup" xmlns:wpi="http://schemas.microsoft.com/office/word/2010/wordprocessingInk" xmlns:wne="http://schemas.microsoft.com/office/word/2006/wordml" xmlns:wps="http://schemas.microsoft.com/office/word/2010/wordprocessingShape" mc:Ignorable="w14 w15 w16se w16cid w16 w16cex w16sdtdh w16sdtfl w16du wp14">
   <w:abstractNum w:abstractNumId="0" w15:restartNumberingAfterBreak="0">
+    <w:nsid w:val="05BC2124"/>
+    <w:multiLevelType w:val="multilevel"/>
+    <w:tmpl w:val="5552A202"/>
+    <w:lvl w:ilvl="0">
+      <w:start w:val="1"/>
+      <w:numFmt w:val="bullet"/>
+      <w:lvlText w:val=""/>
+      <w:lvlJc w:val="left"/>
+      <w:pPr>
+        <w:tabs>
+          <w:tab w:val="num" w:pos="720"/>
+        </w:tabs>
+        <w:ind w:left="720" w:hanging="360"/>
+      </w:pPr>
+      <w:rPr>
+        <w:rFonts w:ascii="Symbol" w:hAnsi="Symbol" w:hint="default"/>
+        <w:sz w:val="20"/>
+      </w:rPr>
+    </w:lvl>
+    <w:lvl w:ilvl="1" w:tentative="1">
+      <w:start w:val="1"/>
+      <w:numFmt w:val="bullet"/>
+      <w:lvlText w:val="o"/>
+      <w:lvlJc w:val="left"/>
+      <w:pPr>
+        <w:tabs>
+          <w:tab w:val="num" w:pos="1440"/>
+        </w:tabs>
+        <w:ind w:left="1440" w:hanging="360"/>
+      </w:pPr>
+      <w:rPr>
+        <w:rFonts w:ascii="Courier New" w:hAnsi="Courier New" w:hint="default"/>
+        <w:sz w:val="20"/>
+      </w:rPr>
+    </w:lvl>
+    <w:lvl w:ilvl="2" w:tentative="1">
+      <w:start w:val="1"/>
+      <w:numFmt w:val="bullet"/>
+      <w:lvlText w:val=""/>
+      <w:lvlJc w:val="left"/>
+      <w:pPr>
+        <w:tabs>
+          <w:tab w:val="num" w:pos="2160"/>
+        </w:tabs>
+        <w:ind w:left="2160" w:hanging="360"/>
+      </w:pPr>
+      <w:rPr>
+        <w:rFonts w:ascii="Wingdings" w:hAnsi="Wingdings" w:hint="default"/>
+        <w:sz w:val="20"/>
+      </w:rPr>
+    </w:lvl>
+    <w:lvl w:ilvl="3" w:tentative="1">
+      <w:start w:val="1"/>
+      <w:numFmt w:val="bullet"/>
+      <w:lvlText w:val=""/>
+      <w:lvlJc w:val="left"/>
+      <w:pPr>
+        <w:tabs>
+          <w:tab w:val="num" w:pos="2880"/>
+        </w:tabs>
+        <w:ind w:left="2880" w:hanging="360"/>
+      </w:pPr>
+      <w:rPr>
+        <w:rFonts w:ascii="Wingdings" w:hAnsi="Wingdings" w:hint="default"/>
+        <w:sz w:val="20"/>
+      </w:rPr>
+    </w:lvl>
+    <w:lvl w:ilvl="4" w:tentative="1">
+      <w:start w:val="1"/>
+      <w:numFmt w:val="bullet"/>
+      <w:lvlText w:val=""/>
+      <w:lvlJc w:val="left"/>
+      <w:pPr>
+        <w:tabs>
+          <w:tab w:val="num" w:pos="3600"/>
+        </w:tabs>
+        <w:ind w:left="3600" w:hanging="360"/>
+      </w:pPr>
+      <w:rPr>
+        <w:rFonts w:ascii="Wingdings" w:hAnsi="Wingdings" w:hint="default"/>
+        <w:sz w:val="20"/>
+      </w:rPr>
+    </w:lvl>
+    <w:lvl w:ilvl="5" w:tentative="1">
+      <w:start w:val="1"/>
+      <w:numFmt w:val="bullet"/>
+      <w:lvlText w:val=""/>
+      <w:lvlJc w:val="left"/>
+      <w:pPr>
+        <w:tabs>
+          <w:tab w:val="num" w:pos="4320"/>
+        </w:tabs>
+        <w:ind w:left="4320" w:hanging="360"/>
+      </w:pPr>
+      <w:rPr>
+        <w:rFonts w:ascii="Wingdings" w:hAnsi="Wingdings" w:hint="default"/>
+        <w:sz w:val="20"/>
+      </w:rPr>
+    </w:lvl>
+    <w:lvl w:ilvl="6" w:tentative="1">
+      <w:start w:val="1"/>
+      <w:numFmt w:val="bullet"/>
+      <w:lvlText w:val=""/>
+      <w:lvlJc w:val="left"/>
+      <w:pPr>
+        <w:tabs>
+          <w:tab w:val="num" w:pos="5040"/>
+        </w:tabs>
+        <w:ind w:left="5040" w:hanging="360"/>
+      </w:pPr>
+      <w:rPr>
+        <w:rFonts w:ascii="Wingdings" w:hAnsi="Wingdings" w:hint="default"/>
+        <w:sz w:val="20"/>
+      </w:rPr>
+    </w:lvl>
+    <w:lvl w:ilvl="7" w:tentative="1">
+      <w:start w:val="1"/>
+      <w:numFmt w:val="bullet"/>
+      <w:lvlText w:val=""/>
+      <w:lvlJc w:val="left"/>
+      <w:pPr>
+        <w:tabs>
+          <w:tab w:val="num" w:pos="5760"/>
+        </w:tabs>
+        <w:ind w:left="5760" w:hanging="360"/>
+      </w:pPr>
+      <w:rPr>
+        <w:rFonts w:ascii="Wingdings" w:hAnsi="Wingdings" w:hint="default"/>
+        <w:sz w:val="20"/>
+      </w:rPr>
+    </w:lvl>
+    <w:lvl w:ilvl="8" w:tentative="1">
+      <w:start w:val="1"/>
+      <w:numFmt w:val="bullet"/>
+      <w:lvlText w:val=""/>
+      <w:lvlJc w:val="left"/>
+      <w:pPr>
+        <w:tabs>
+          <w:tab w:val="num" w:pos="6480"/>
+        </w:tabs>
+        <w:ind w:left="6480" w:hanging="360"/>
+      </w:pPr>
+      <w:rPr>
+        <w:rFonts w:ascii="Wingdings" w:hAnsi="Wingdings" w:hint="default"/>
+        <w:sz w:val="20"/>
+      </w:rPr>
+    </w:lvl>
+  </w:abstractNum>
+  <w:abstractNum w:abstractNumId="1" w15:restartNumberingAfterBreak="0">
+    <w:nsid w:val="1413413E"/>
+    <w:multiLevelType w:val="multilevel"/>
+    <w:tmpl w:val="4D588AF0"/>
+    <w:lvl w:ilvl="0">
+      <w:start w:val="1"/>
+      <w:numFmt w:val="bullet"/>
+      <w:lvlText w:val=""/>
+      <w:lvlJc w:val="left"/>
+      <w:pPr>
+        <w:tabs>
+          <w:tab w:val="num" w:pos="720"/>
+        </w:tabs>
+        <w:ind w:left="720" w:hanging="360"/>
+      </w:pPr>
+      <w:rPr>
+        <w:rFonts w:ascii="Symbol" w:hAnsi="Symbol" w:hint="default"/>
+        <w:sz w:val="20"/>
+      </w:rPr>
+    </w:lvl>
+    <w:lvl w:ilvl="1" w:tentative="1">
+      <w:start w:val="1"/>
+      <w:numFmt w:val="bullet"/>
+      <w:lvlText w:val="o"/>
+      <w:lvlJc w:val="left"/>
+      <w:pPr>
+        <w:tabs>
+          <w:tab w:val="num" w:pos="1440"/>
+        </w:tabs>
+        <w:ind w:left="1440" w:hanging="360"/>
+      </w:pPr>
+      <w:rPr>
+        <w:rFonts w:ascii="Courier New" w:hAnsi="Courier New" w:hint="default"/>
+        <w:sz w:val="20"/>
+      </w:rPr>
+    </w:lvl>
+    <w:lvl w:ilvl="2" w:tentative="1">
+      <w:start w:val="1"/>
+      <w:numFmt w:val="bullet"/>
+      <w:lvlText w:val=""/>
+      <w:lvlJc w:val="left"/>
+      <w:pPr>
+        <w:tabs>
+          <w:tab w:val="num" w:pos="2160"/>
+        </w:tabs>
+        <w:ind w:left="2160" w:hanging="360"/>
+      </w:pPr>
+      <w:rPr>
+        <w:rFonts w:ascii="Wingdings" w:hAnsi="Wingdings" w:hint="default"/>
+        <w:sz w:val="20"/>
+      </w:rPr>
+    </w:lvl>
+    <w:lvl w:ilvl="3" w:tentative="1">
+      <w:start w:val="1"/>
+      <w:numFmt w:val="bullet"/>
+      <w:lvlText w:val=""/>
+      <w:lvlJc w:val="left"/>
+      <w:pPr>
+        <w:tabs>
+          <w:tab w:val="num" w:pos="2880"/>
+        </w:tabs>
+        <w:ind w:left="2880" w:hanging="360"/>
+      </w:pPr>
+      <w:rPr>
+        <w:rFonts w:ascii="Wingdings" w:hAnsi="Wingdings" w:hint="default"/>
+        <w:sz w:val="20"/>
+      </w:rPr>
+    </w:lvl>
+    <w:lvl w:ilvl="4" w:tentative="1">
+      <w:start w:val="1"/>
+      <w:numFmt w:val="bullet"/>
+      <w:lvlText w:val=""/>
+      <w:lvlJc w:val="left"/>
+      <w:pPr>
+        <w:tabs>
+          <w:tab w:val="num" w:pos="3600"/>
+        </w:tabs>
+        <w:ind w:left="3600" w:hanging="360"/>
+      </w:pPr>
+      <w:rPr>
+        <w:rFonts w:ascii="Wingdings" w:hAnsi="Wingdings" w:hint="default"/>
+        <w:sz w:val="20"/>
+      </w:rPr>
+    </w:lvl>
+    <w:lvl w:ilvl="5" w:tentative="1">
+      <w:start w:val="1"/>
+      <w:numFmt w:val="bullet"/>
+      <w:lvlText w:val=""/>
+      <w:lvlJc w:val="left"/>
+      <w:pPr>
+        <w:tabs>
+          <w:tab w:val="num" w:pos="4320"/>
+        </w:tabs>
+        <w:ind w:left="4320" w:hanging="360"/>
+      </w:pPr>
+      <w:rPr>
+        <w:rFonts w:ascii="Wingdings" w:hAnsi="Wingdings" w:hint="default"/>
+        <w:sz w:val="20"/>
+      </w:rPr>
+    </w:lvl>
+    <w:lvl w:ilvl="6" w:tentative="1">
+      <w:start w:val="1"/>
+      <w:numFmt w:val="bullet"/>
+      <w:lvlText w:val=""/>
+      <w:lvlJc w:val="left"/>
+      <w:pPr>
+        <w:tabs>
+          <w:tab w:val="num" w:pos="5040"/>
+        </w:tabs>
+        <w:ind w:left="5040" w:hanging="360"/>
+      </w:pPr>
+      <w:rPr>
+        <w:rFonts w:ascii="Wingdings" w:hAnsi="Wingdings" w:hint="default"/>
+        <w:sz w:val="20"/>
+      </w:rPr>
+    </w:lvl>
+    <w:lvl w:ilvl="7" w:tentative="1">
+      <w:start w:val="1"/>
+      <w:numFmt w:val="bullet"/>
+      <w:lvlText w:val=""/>
+      <w:lvlJc w:val="left"/>
+      <w:pPr>
+        <w:tabs>
+          <w:tab w:val="num" w:pos="5760"/>
+        </w:tabs>
+        <w:ind w:left="5760" w:hanging="360"/>
+      </w:pPr>
+      <w:rPr>
+        <w:rFonts w:ascii="Wingdings" w:hAnsi="Wingdings" w:hint="default"/>
+        <w:sz w:val="20"/>
+      </w:rPr>
+    </w:lvl>
+    <w:lvl w:ilvl="8" w:tentative="1">
+      <w:start w:val="1"/>
+      <w:numFmt w:val="bullet"/>
+      <w:lvlText w:val=""/>
+      <w:lvlJc w:val="left"/>
+      <w:pPr>
+        <w:tabs>
+          <w:tab w:val="num" w:pos="6480"/>
+        </w:tabs>
+        <w:ind w:left="6480" w:hanging="360"/>
+      </w:pPr>
+      <w:rPr>
+        <w:rFonts w:ascii="Wingdings" w:hAnsi="Wingdings" w:hint="default"/>
+        <w:sz w:val="20"/>
+      </w:rPr>
+    </w:lvl>
+  </w:abstractNum>
+  <w:abstractNum w:abstractNumId="2" w15:restartNumberingAfterBreak="0">
+    <w:nsid w:val="18DD7FF9"/>
+    <w:multiLevelType w:val="multilevel"/>
+    <w:tmpl w:val="6EE4977C"/>
+    <w:lvl w:ilvl="0">
+      <w:start w:val="1"/>
+      <w:numFmt w:val="bullet"/>
+      <w:lvlText w:val=""/>
+      <w:lvlJc w:val="left"/>
+      <w:pPr>
+        <w:tabs>
+          <w:tab w:val="num" w:pos="720"/>
+        </w:tabs>
+        <w:ind w:left="720" w:hanging="360"/>
+      </w:pPr>
+      <w:rPr>
+        <w:rFonts w:ascii="Symbol" w:hAnsi="Symbol" w:hint="default"/>
+        <w:sz w:val="20"/>
+      </w:rPr>
+    </w:lvl>
+    <w:lvl w:ilvl="1" w:tentative="1">
+      <w:start w:val="1"/>
+      <w:numFmt w:val="bullet"/>
+      <w:lvlText w:val="o"/>
+      <w:lvlJc w:val="left"/>
+      <w:pPr>
+        <w:tabs>
+          <w:tab w:val="num" w:pos="1440"/>
+        </w:tabs>
+        <w:ind w:left="1440" w:hanging="360"/>
+      </w:pPr>
+      <w:rPr>
+        <w:rFonts w:ascii="Courier New" w:hAnsi="Courier New" w:hint="default"/>
+        <w:sz w:val="20"/>
+      </w:rPr>
+    </w:lvl>
+    <w:lvl w:ilvl="2" w:tentative="1">
+      <w:start w:val="1"/>
+      <w:numFmt w:val="bullet"/>
+      <w:lvlText w:val=""/>
+      <w:lvlJc w:val="left"/>
+      <w:pPr>
+        <w:tabs>
+          <w:tab w:val="num" w:pos="2160"/>
+        </w:tabs>
+        <w:ind w:left="2160" w:hanging="360"/>
+      </w:pPr>
+      <w:rPr>
+        <w:rFonts w:ascii="Wingdings" w:hAnsi="Wingdings" w:hint="default"/>
+        <w:sz w:val="20"/>
+      </w:rPr>
+    </w:lvl>
+    <w:lvl w:ilvl="3" w:tentative="1">
+      <w:start w:val="1"/>
+      <w:numFmt w:val="bullet"/>
+      <w:lvlText w:val=""/>
+      <w:lvlJc w:val="left"/>
+      <w:pPr>
+        <w:tabs>
+          <w:tab w:val="num" w:pos="2880"/>
+        </w:tabs>
+        <w:ind w:left="2880" w:hanging="360"/>
+      </w:pPr>
+      <w:rPr>
+        <w:rFonts w:ascii="Wingdings" w:hAnsi="Wingdings" w:hint="default"/>
+        <w:sz w:val="20"/>
+      </w:rPr>
+    </w:lvl>
+    <w:lvl w:ilvl="4" w:tentative="1">
+      <w:start w:val="1"/>
+      <w:numFmt w:val="bullet"/>
+      <w:lvlText w:val=""/>
+      <w:lvlJc w:val="left"/>
+      <w:pPr>
+        <w:tabs>
+          <w:tab w:val="num" w:pos="3600"/>
+        </w:tabs>
+        <w:ind w:left="3600" w:hanging="360"/>
+      </w:pPr>
+      <w:rPr>
+        <w:rFonts w:ascii="Wingdings" w:hAnsi="Wingdings" w:hint="default"/>
+        <w:sz w:val="20"/>
+      </w:rPr>
+    </w:lvl>
+    <w:lvl w:ilvl="5" w:tentative="1">
+      <w:start w:val="1"/>
+      <w:numFmt w:val="bullet"/>
+      <w:lvlText w:val=""/>
+      <w:lvlJc w:val="left"/>
+      <w:pPr>
+        <w:tabs>
+          <w:tab w:val="num" w:pos="4320"/>
+        </w:tabs>
+        <w:ind w:left="4320" w:hanging="360"/>
+      </w:pPr>
+      <w:rPr>
+        <w:rFonts w:ascii="Wingdings" w:hAnsi="Wingdings" w:hint="default"/>
+        <w:sz w:val="20"/>
+      </w:rPr>
+    </w:lvl>
+    <w:lvl w:ilvl="6" w:tentative="1">
+      <w:start w:val="1"/>
+      <w:numFmt w:val="bullet"/>
+      <w:lvlText w:val=""/>
+      <w:lvlJc w:val="left"/>
+      <w:pPr>
+        <w:tabs>
+          <w:tab w:val="num" w:pos="5040"/>
+        </w:tabs>
+        <w:ind w:left="5040" w:hanging="360"/>
+      </w:pPr>
+      <w:rPr>
+        <w:rFonts w:ascii="Wingdings" w:hAnsi="Wingdings" w:hint="default"/>
+        <w:sz w:val="20"/>
+      </w:rPr>
+    </w:lvl>
+    <w:lvl w:ilvl="7" w:tentative="1">
+      <w:start w:val="1"/>
+      <w:numFmt w:val="bullet"/>
+      <w:lvlText w:val=""/>
+      <w:lvlJc w:val="left"/>
+      <w:pPr>
+        <w:tabs>
+          <w:tab w:val="num" w:pos="5760"/>
+        </w:tabs>
+        <w:ind w:left="5760" w:hanging="360"/>
+      </w:pPr>
+      <w:rPr>
+        <w:rFonts w:ascii="Wingdings" w:hAnsi="Wingdings" w:hint="default"/>
+        <w:sz w:val="20"/>
+      </w:rPr>
+    </w:lvl>
+    <w:lvl w:ilvl="8" w:tentative="1">
+      <w:start w:val="1"/>
+      <w:numFmt w:val="bullet"/>
+      <w:lvlText w:val=""/>
+      <w:lvlJc w:val="left"/>
+      <w:pPr>
+        <w:tabs>
+          <w:tab w:val="num" w:pos="6480"/>
+        </w:tabs>
+        <w:ind w:left="6480" w:hanging="360"/>
+      </w:pPr>
+      <w:rPr>
+        <w:rFonts w:ascii="Wingdings" w:hAnsi="Wingdings" w:hint="default"/>
+        <w:sz w:val="20"/>
+      </w:rPr>
+    </w:lvl>
+  </w:abstractNum>
+  <w:abstractNum w:abstractNumId="3" w15:restartNumberingAfterBreak="0">
+    <w:nsid w:val="1B27634E"/>
+    <w:multiLevelType w:val="multilevel"/>
+    <w:tmpl w:val="DFE4A7A6"/>
+    <w:lvl w:ilvl="0">
+      <w:start w:val="1"/>
+      <w:numFmt w:val="bullet"/>
+      <w:lvlText w:val=""/>
+      <w:lvlJc w:val="left"/>
+      <w:pPr>
+        <w:tabs>
+          <w:tab w:val="num" w:pos="720"/>
+        </w:tabs>
+        <w:ind w:left="720" w:hanging="360"/>
+      </w:pPr>
+      <w:rPr>
+        <w:rFonts w:ascii="Symbol" w:hAnsi="Symbol" w:hint="default"/>
+        <w:sz w:val="20"/>
+      </w:rPr>
+    </w:lvl>
+    <w:lvl w:ilvl="1" w:tentative="1">
+      <w:start w:val="1"/>
+      <w:numFmt w:val="bullet"/>
+      <w:lvlText w:val="o"/>
+      <w:lvlJc w:val="left"/>
+      <w:pPr>
+        <w:tabs>
+          <w:tab w:val="num" w:pos="1440"/>
+        </w:tabs>
+        <w:ind w:left="1440" w:hanging="360"/>
+      </w:pPr>
+      <w:rPr>
+        <w:rFonts w:ascii="Courier New" w:hAnsi="Courier New" w:hint="default"/>
+        <w:sz w:val="20"/>
+      </w:rPr>
+    </w:lvl>
+    <w:lvl w:ilvl="2" w:tentative="1">
+      <w:start w:val="1"/>
+      <w:numFmt w:val="bullet"/>
+      <w:lvlText w:val=""/>
+      <w:lvlJc w:val="left"/>
+      <w:pPr>
+        <w:tabs>
+          <w:tab w:val="num" w:pos="2160"/>
+        </w:tabs>
+        <w:ind w:left="2160" w:hanging="360"/>
+      </w:pPr>
+      <w:rPr>
+        <w:rFonts w:ascii="Wingdings" w:hAnsi="Wingdings" w:hint="default"/>
+        <w:sz w:val="20"/>
+      </w:rPr>
+    </w:lvl>
+    <w:lvl w:ilvl="3" w:tentative="1">
+      <w:start w:val="1"/>
+      <w:numFmt w:val="bullet"/>
+      <w:lvlText w:val=""/>
+      <w:lvlJc w:val="left"/>
+      <w:pPr>
+        <w:tabs>
+          <w:tab w:val="num" w:pos="2880"/>
+        </w:tabs>
+        <w:ind w:left="2880" w:hanging="360"/>
+      </w:pPr>
+      <w:rPr>
+        <w:rFonts w:ascii="Wingdings" w:hAnsi="Wingdings" w:hint="default"/>
+        <w:sz w:val="20"/>
+      </w:rPr>
+    </w:lvl>
+    <w:lvl w:ilvl="4" w:tentative="1">
+      <w:start w:val="1"/>
+      <w:numFmt w:val="bullet"/>
+      <w:lvlText w:val=""/>
+      <w:lvlJc w:val="left"/>
+      <w:pPr>
+        <w:tabs>
+          <w:tab w:val="num" w:pos="3600"/>
+        </w:tabs>
+        <w:ind w:left="3600" w:hanging="360"/>
+      </w:pPr>
+      <w:rPr>
+        <w:rFonts w:ascii="Wingdings" w:hAnsi="Wingdings" w:hint="default"/>
+        <w:sz w:val="20"/>
+      </w:rPr>
+    </w:lvl>
+    <w:lvl w:ilvl="5" w:tentative="1">
+      <w:start w:val="1"/>
+      <w:numFmt w:val="bullet"/>
+      <w:lvlText w:val=""/>
+      <w:lvlJc w:val="left"/>
+      <w:pPr>
+        <w:tabs>
+          <w:tab w:val="num" w:pos="4320"/>
+        </w:tabs>
+        <w:ind w:left="4320" w:hanging="360"/>
+      </w:pPr>
+      <w:rPr>
+        <w:rFonts w:ascii="Wingdings" w:hAnsi="Wingdings" w:hint="default"/>
+        <w:sz w:val="20"/>
+      </w:rPr>
+    </w:lvl>
+    <w:lvl w:ilvl="6" w:tentative="1">
+      <w:start w:val="1"/>
+      <w:numFmt w:val="bullet"/>
+      <w:lvlText w:val=""/>
+      <w:lvlJc w:val="left"/>
+      <w:pPr>
+        <w:tabs>
+          <w:tab w:val="num" w:pos="5040"/>
+        </w:tabs>
+        <w:ind w:left="5040" w:hanging="360"/>
+      </w:pPr>
+      <w:rPr>
+        <w:rFonts w:ascii="Wingdings" w:hAnsi="Wingdings" w:hint="default"/>
+        <w:sz w:val="20"/>
+      </w:rPr>
+    </w:lvl>
+    <w:lvl w:ilvl="7" w:tentative="1">
+      <w:start w:val="1"/>
+      <w:numFmt w:val="bullet"/>
+      <w:lvlText w:val=""/>
+      <w:lvlJc w:val="left"/>
+      <w:pPr>
+        <w:tabs>
+          <w:tab w:val="num" w:pos="5760"/>
+        </w:tabs>
+        <w:ind w:left="5760" w:hanging="360"/>
+      </w:pPr>
+      <w:rPr>
+        <w:rFonts w:ascii="Wingdings" w:hAnsi="Wingdings" w:hint="default"/>
+        <w:sz w:val="20"/>
+      </w:rPr>
+    </w:lvl>
+    <w:lvl w:ilvl="8" w:tentative="1">
+      <w:start w:val="1"/>
+      <w:numFmt w:val="bullet"/>
+      <w:lvlText w:val=""/>
+      <w:lvlJc w:val="left"/>
+      <w:pPr>
+        <w:tabs>
+          <w:tab w:val="num" w:pos="6480"/>
+        </w:tabs>
+        <w:ind w:left="6480" w:hanging="360"/>
+      </w:pPr>
+      <w:rPr>
+        <w:rFonts w:ascii="Wingdings" w:hAnsi="Wingdings" w:hint="default"/>
+        <w:sz w:val="20"/>
+      </w:rPr>
+    </w:lvl>
+  </w:abstractNum>
+  <w:abstractNum w:abstractNumId="4" w15:restartNumberingAfterBreak="0">
     <w:nsid w:val="21824012"/>
     <w:multiLevelType w:val="hybridMultilevel"/>
     <w:tmpl w:val="AB846582"/>
@@ -277,8 +870,1048 @@
       </w:rPr>
     </w:lvl>
   </w:abstractNum>
+  <w:abstractNum w:abstractNumId="5" w15:restartNumberingAfterBreak="0">
+    <w:nsid w:val="22A4245A"/>
+    <w:multiLevelType w:val="multilevel"/>
+    <w:tmpl w:val="AA82BEA0"/>
+    <w:lvl w:ilvl="0">
+      <w:start w:val="1"/>
+      <w:numFmt w:val="bullet"/>
+      <w:lvlText w:val=""/>
+      <w:lvlJc w:val="left"/>
+      <w:pPr>
+        <w:tabs>
+          <w:tab w:val="num" w:pos="720"/>
+        </w:tabs>
+        <w:ind w:left="720" w:hanging="360"/>
+      </w:pPr>
+      <w:rPr>
+        <w:rFonts w:ascii="Symbol" w:hAnsi="Symbol" w:hint="default"/>
+        <w:sz w:val="20"/>
+      </w:rPr>
+    </w:lvl>
+    <w:lvl w:ilvl="1" w:tentative="1">
+      <w:start w:val="1"/>
+      <w:numFmt w:val="bullet"/>
+      <w:lvlText w:val="o"/>
+      <w:lvlJc w:val="left"/>
+      <w:pPr>
+        <w:tabs>
+          <w:tab w:val="num" w:pos="1440"/>
+        </w:tabs>
+        <w:ind w:left="1440" w:hanging="360"/>
+      </w:pPr>
+      <w:rPr>
+        <w:rFonts w:ascii="Courier New" w:hAnsi="Courier New" w:hint="default"/>
+        <w:sz w:val="20"/>
+      </w:rPr>
+    </w:lvl>
+    <w:lvl w:ilvl="2" w:tentative="1">
+      <w:start w:val="1"/>
+      <w:numFmt w:val="bullet"/>
+      <w:lvlText w:val=""/>
+      <w:lvlJc w:val="left"/>
+      <w:pPr>
+        <w:tabs>
+          <w:tab w:val="num" w:pos="2160"/>
+        </w:tabs>
+        <w:ind w:left="2160" w:hanging="360"/>
+      </w:pPr>
+      <w:rPr>
+        <w:rFonts w:ascii="Wingdings" w:hAnsi="Wingdings" w:hint="default"/>
+        <w:sz w:val="20"/>
+      </w:rPr>
+    </w:lvl>
+    <w:lvl w:ilvl="3" w:tentative="1">
+      <w:start w:val="1"/>
+      <w:numFmt w:val="bullet"/>
+      <w:lvlText w:val=""/>
+      <w:lvlJc w:val="left"/>
+      <w:pPr>
+        <w:tabs>
+          <w:tab w:val="num" w:pos="2880"/>
+        </w:tabs>
+        <w:ind w:left="2880" w:hanging="360"/>
+      </w:pPr>
+      <w:rPr>
+        <w:rFonts w:ascii="Wingdings" w:hAnsi="Wingdings" w:hint="default"/>
+        <w:sz w:val="20"/>
+      </w:rPr>
+    </w:lvl>
+    <w:lvl w:ilvl="4" w:tentative="1">
+      <w:start w:val="1"/>
+      <w:numFmt w:val="bullet"/>
+      <w:lvlText w:val=""/>
+      <w:lvlJc w:val="left"/>
+      <w:pPr>
+        <w:tabs>
+          <w:tab w:val="num" w:pos="3600"/>
+        </w:tabs>
+        <w:ind w:left="3600" w:hanging="360"/>
+      </w:pPr>
+      <w:rPr>
+        <w:rFonts w:ascii="Wingdings" w:hAnsi="Wingdings" w:hint="default"/>
+        <w:sz w:val="20"/>
+      </w:rPr>
+    </w:lvl>
+    <w:lvl w:ilvl="5" w:tentative="1">
+      <w:start w:val="1"/>
+      <w:numFmt w:val="bullet"/>
+      <w:lvlText w:val=""/>
+      <w:lvlJc w:val="left"/>
+      <w:pPr>
+        <w:tabs>
+          <w:tab w:val="num" w:pos="4320"/>
+        </w:tabs>
+        <w:ind w:left="4320" w:hanging="360"/>
+      </w:pPr>
+      <w:rPr>
+        <w:rFonts w:ascii="Wingdings" w:hAnsi="Wingdings" w:hint="default"/>
+        <w:sz w:val="20"/>
+      </w:rPr>
+    </w:lvl>
+    <w:lvl w:ilvl="6" w:tentative="1">
+      <w:start w:val="1"/>
+      <w:numFmt w:val="bullet"/>
+      <w:lvlText w:val=""/>
+      <w:lvlJc w:val="left"/>
+      <w:pPr>
+        <w:tabs>
+          <w:tab w:val="num" w:pos="5040"/>
+        </w:tabs>
+        <w:ind w:left="5040" w:hanging="360"/>
+      </w:pPr>
+      <w:rPr>
+        <w:rFonts w:ascii="Wingdings" w:hAnsi="Wingdings" w:hint="default"/>
+        <w:sz w:val="20"/>
+      </w:rPr>
+    </w:lvl>
+    <w:lvl w:ilvl="7" w:tentative="1">
+      <w:start w:val="1"/>
+      <w:numFmt w:val="bullet"/>
+      <w:lvlText w:val=""/>
+      <w:lvlJc w:val="left"/>
+      <w:pPr>
+        <w:tabs>
+          <w:tab w:val="num" w:pos="5760"/>
+        </w:tabs>
+        <w:ind w:left="5760" w:hanging="360"/>
+      </w:pPr>
+      <w:rPr>
+        <w:rFonts w:ascii="Wingdings" w:hAnsi="Wingdings" w:hint="default"/>
+        <w:sz w:val="20"/>
+      </w:rPr>
+    </w:lvl>
+    <w:lvl w:ilvl="8" w:tentative="1">
+      <w:start w:val="1"/>
+      <w:numFmt w:val="bullet"/>
+      <w:lvlText w:val=""/>
+      <w:lvlJc w:val="left"/>
+      <w:pPr>
+        <w:tabs>
+          <w:tab w:val="num" w:pos="6480"/>
+        </w:tabs>
+        <w:ind w:left="6480" w:hanging="360"/>
+      </w:pPr>
+      <w:rPr>
+        <w:rFonts w:ascii="Wingdings" w:hAnsi="Wingdings" w:hint="default"/>
+        <w:sz w:val="20"/>
+      </w:rPr>
+    </w:lvl>
+  </w:abstractNum>
+  <w:abstractNum w:abstractNumId="6" w15:restartNumberingAfterBreak="0">
+    <w:nsid w:val="26204DA1"/>
+    <w:multiLevelType w:val="multilevel"/>
+    <w:tmpl w:val="99863550"/>
+    <w:lvl w:ilvl="0">
+      <w:start w:val="1"/>
+      <w:numFmt w:val="bullet"/>
+      <w:lvlText w:val=""/>
+      <w:lvlJc w:val="left"/>
+      <w:pPr>
+        <w:tabs>
+          <w:tab w:val="num" w:pos="720"/>
+        </w:tabs>
+        <w:ind w:left="720" w:hanging="360"/>
+      </w:pPr>
+      <w:rPr>
+        <w:rFonts w:ascii="Symbol" w:hAnsi="Symbol" w:hint="default"/>
+        <w:sz w:val="20"/>
+      </w:rPr>
+    </w:lvl>
+    <w:lvl w:ilvl="1" w:tentative="1">
+      <w:start w:val="1"/>
+      <w:numFmt w:val="bullet"/>
+      <w:lvlText w:val="o"/>
+      <w:lvlJc w:val="left"/>
+      <w:pPr>
+        <w:tabs>
+          <w:tab w:val="num" w:pos="1440"/>
+        </w:tabs>
+        <w:ind w:left="1440" w:hanging="360"/>
+      </w:pPr>
+      <w:rPr>
+        <w:rFonts w:ascii="Courier New" w:hAnsi="Courier New" w:hint="default"/>
+        <w:sz w:val="20"/>
+      </w:rPr>
+    </w:lvl>
+    <w:lvl w:ilvl="2" w:tentative="1">
+      <w:start w:val="1"/>
+      <w:numFmt w:val="bullet"/>
+      <w:lvlText w:val=""/>
+      <w:lvlJc w:val="left"/>
+      <w:pPr>
+        <w:tabs>
+          <w:tab w:val="num" w:pos="2160"/>
+        </w:tabs>
+        <w:ind w:left="2160" w:hanging="360"/>
+      </w:pPr>
+      <w:rPr>
+        <w:rFonts w:ascii="Wingdings" w:hAnsi="Wingdings" w:hint="default"/>
+        <w:sz w:val="20"/>
+      </w:rPr>
+    </w:lvl>
+    <w:lvl w:ilvl="3" w:tentative="1">
+      <w:start w:val="1"/>
+      <w:numFmt w:val="bullet"/>
+      <w:lvlText w:val=""/>
+      <w:lvlJc w:val="left"/>
+      <w:pPr>
+        <w:tabs>
+          <w:tab w:val="num" w:pos="2880"/>
+        </w:tabs>
+        <w:ind w:left="2880" w:hanging="360"/>
+      </w:pPr>
+      <w:rPr>
+        <w:rFonts w:ascii="Wingdings" w:hAnsi="Wingdings" w:hint="default"/>
+        <w:sz w:val="20"/>
+      </w:rPr>
+    </w:lvl>
+    <w:lvl w:ilvl="4" w:tentative="1">
+      <w:start w:val="1"/>
+      <w:numFmt w:val="bullet"/>
+      <w:lvlText w:val=""/>
+      <w:lvlJc w:val="left"/>
+      <w:pPr>
+        <w:tabs>
+          <w:tab w:val="num" w:pos="3600"/>
+        </w:tabs>
+        <w:ind w:left="3600" w:hanging="360"/>
+      </w:pPr>
+      <w:rPr>
+        <w:rFonts w:ascii="Wingdings" w:hAnsi="Wingdings" w:hint="default"/>
+        <w:sz w:val="20"/>
+      </w:rPr>
+    </w:lvl>
+    <w:lvl w:ilvl="5" w:tentative="1">
+      <w:start w:val="1"/>
+      <w:numFmt w:val="bullet"/>
+      <w:lvlText w:val=""/>
+      <w:lvlJc w:val="left"/>
+      <w:pPr>
+        <w:tabs>
+          <w:tab w:val="num" w:pos="4320"/>
+        </w:tabs>
+        <w:ind w:left="4320" w:hanging="360"/>
+      </w:pPr>
+      <w:rPr>
+        <w:rFonts w:ascii="Wingdings" w:hAnsi="Wingdings" w:hint="default"/>
+        <w:sz w:val="20"/>
+      </w:rPr>
+    </w:lvl>
+    <w:lvl w:ilvl="6" w:tentative="1">
+      <w:start w:val="1"/>
+      <w:numFmt w:val="bullet"/>
+      <w:lvlText w:val=""/>
+      <w:lvlJc w:val="left"/>
+      <w:pPr>
+        <w:tabs>
+          <w:tab w:val="num" w:pos="5040"/>
+        </w:tabs>
+        <w:ind w:left="5040" w:hanging="360"/>
+      </w:pPr>
+      <w:rPr>
+        <w:rFonts w:ascii="Wingdings" w:hAnsi="Wingdings" w:hint="default"/>
+        <w:sz w:val="20"/>
+      </w:rPr>
+    </w:lvl>
+    <w:lvl w:ilvl="7" w:tentative="1">
+      <w:start w:val="1"/>
+      <w:numFmt w:val="bullet"/>
+      <w:lvlText w:val=""/>
+      <w:lvlJc w:val="left"/>
+      <w:pPr>
+        <w:tabs>
+          <w:tab w:val="num" w:pos="5760"/>
+        </w:tabs>
+        <w:ind w:left="5760" w:hanging="360"/>
+      </w:pPr>
+      <w:rPr>
+        <w:rFonts w:ascii="Wingdings" w:hAnsi="Wingdings" w:hint="default"/>
+        <w:sz w:val="20"/>
+      </w:rPr>
+    </w:lvl>
+    <w:lvl w:ilvl="8" w:tentative="1">
+      <w:start w:val="1"/>
+      <w:numFmt w:val="bullet"/>
+      <w:lvlText w:val=""/>
+      <w:lvlJc w:val="left"/>
+      <w:pPr>
+        <w:tabs>
+          <w:tab w:val="num" w:pos="6480"/>
+        </w:tabs>
+        <w:ind w:left="6480" w:hanging="360"/>
+      </w:pPr>
+      <w:rPr>
+        <w:rFonts w:ascii="Wingdings" w:hAnsi="Wingdings" w:hint="default"/>
+        <w:sz w:val="20"/>
+      </w:rPr>
+    </w:lvl>
+  </w:abstractNum>
+  <w:abstractNum w:abstractNumId="7" w15:restartNumberingAfterBreak="0">
+    <w:nsid w:val="2F5F11C4"/>
+    <w:multiLevelType w:val="multilevel"/>
+    <w:tmpl w:val="61324F80"/>
+    <w:lvl w:ilvl="0">
+      <w:start w:val="1"/>
+      <w:numFmt w:val="bullet"/>
+      <w:lvlText w:val=""/>
+      <w:lvlJc w:val="left"/>
+      <w:pPr>
+        <w:tabs>
+          <w:tab w:val="num" w:pos="720"/>
+        </w:tabs>
+        <w:ind w:left="720" w:hanging="360"/>
+      </w:pPr>
+      <w:rPr>
+        <w:rFonts w:ascii="Symbol" w:hAnsi="Symbol" w:hint="default"/>
+        <w:sz w:val="20"/>
+      </w:rPr>
+    </w:lvl>
+    <w:lvl w:ilvl="1" w:tentative="1">
+      <w:start w:val="1"/>
+      <w:numFmt w:val="bullet"/>
+      <w:lvlText w:val="o"/>
+      <w:lvlJc w:val="left"/>
+      <w:pPr>
+        <w:tabs>
+          <w:tab w:val="num" w:pos="1440"/>
+        </w:tabs>
+        <w:ind w:left="1440" w:hanging="360"/>
+      </w:pPr>
+      <w:rPr>
+        <w:rFonts w:ascii="Courier New" w:hAnsi="Courier New" w:hint="default"/>
+        <w:sz w:val="20"/>
+      </w:rPr>
+    </w:lvl>
+    <w:lvl w:ilvl="2" w:tentative="1">
+      <w:start w:val="1"/>
+      <w:numFmt w:val="bullet"/>
+      <w:lvlText w:val=""/>
+      <w:lvlJc w:val="left"/>
+      <w:pPr>
+        <w:tabs>
+          <w:tab w:val="num" w:pos="2160"/>
+        </w:tabs>
+        <w:ind w:left="2160" w:hanging="360"/>
+      </w:pPr>
+      <w:rPr>
+        <w:rFonts w:ascii="Wingdings" w:hAnsi="Wingdings" w:hint="default"/>
+        <w:sz w:val="20"/>
+      </w:rPr>
+    </w:lvl>
+    <w:lvl w:ilvl="3" w:tentative="1">
+      <w:start w:val="1"/>
+      <w:numFmt w:val="bullet"/>
+      <w:lvlText w:val=""/>
+      <w:lvlJc w:val="left"/>
+      <w:pPr>
+        <w:tabs>
+          <w:tab w:val="num" w:pos="2880"/>
+        </w:tabs>
+        <w:ind w:left="2880" w:hanging="360"/>
+      </w:pPr>
+      <w:rPr>
+        <w:rFonts w:ascii="Wingdings" w:hAnsi="Wingdings" w:hint="default"/>
+        <w:sz w:val="20"/>
+      </w:rPr>
+    </w:lvl>
+    <w:lvl w:ilvl="4" w:tentative="1">
+      <w:start w:val="1"/>
+      <w:numFmt w:val="bullet"/>
+      <w:lvlText w:val=""/>
+      <w:lvlJc w:val="left"/>
+      <w:pPr>
+        <w:tabs>
+          <w:tab w:val="num" w:pos="3600"/>
+        </w:tabs>
+        <w:ind w:left="3600" w:hanging="360"/>
+      </w:pPr>
+      <w:rPr>
+        <w:rFonts w:ascii="Wingdings" w:hAnsi="Wingdings" w:hint="default"/>
+        <w:sz w:val="20"/>
+      </w:rPr>
+    </w:lvl>
+    <w:lvl w:ilvl="5" w:tentative="1">
+      <w:start w:val="1"/>
+      <w:numFmt w:val="bullet"/>
+      <w:lvlText w:val=""/>
+      <w:lvlJc w:val="left"/>
+      <w:pPr>
+        <w:tabs>
+          <w:tab w:val="num" w:pos="4320"/>
+        </w:tabs>
+        <w:ind w:left="4320" w:hanging="360"/>
+      </w:pPr>
+      <w:rPr>
+        <w:rFonts w:ascii="Wingdings" w:hAnsi="Wingdings" w:hint="default"/>
+        <w:sz w:val="20"/>
+      </w:rPr>
+    </w:lvl>
+    <w:lvl w:ilvl="6" w:tentative="1">
+      <w:start w:val="1"/>
+      <w:numFmt w:val="bullet"/>
+      <w:lvlText w:val=""/>
+      <w:lvlJc w:val="left"/>
+      <w:pPr>
+        <w:tabs>
+          <w:tab w:val="num" w:pos="5040"/>
+        </w:tabs>
+        <w:ind w:left="5040" w:hanging="360"/>
+      </w:pPr>
+      <w:rPr>
+        <w:rFonts w:ascii="Wingdings" w:hAnsi="Wingdings" w:hint="default"/>
+        <w:sz w:val="20"/>
+      </w:rPr>
+    </w:lvl>
+    <w:lvl w:ilvl="7" w:tentative="1">
+      <w:start w:val="1"/>
+      <w:numFmt w:val="bullet"/>
+      <w:lvlText w:val=""/>
+      <w:lvlJc w:val="left"/>
+      <w:pPr>
+        <w:tabs>
+          <w:tab w:val="num" w:pos="5760"/>
+        </w:tabs>
+        <w:ind w:left="5760" w:hanging="360"/>
+      </w:pPr>
+      <w:rPr>
+        <w:rFonts w:ascii="Wingdings" w:hAnsi="Wingdings" w:hint="default"/>
+        <w:sz w:val="20"/>
+      </w:rPr>
+    </w:lvl>
+    <w:lvl w:ilvl="8" w:tentative="1">
+      <w:start w:val="1"/>
+      <w:numFmt w:val="bullet"/>
+      <w:lvlText w:val=""/>
+      <w:lvlJc w:val="left"/>
+      <w:pPr>
+        <w:tabs>
+          <w:tab w:val="num" w:pos="6480"/>
+        </w:tabs>
+        <w:ind w:left="6480" w:hanging="360"/>
+      </w:pPr>
+      <w:rPr>
+        <w:rFonts w:ascii="Wingdings" w:hAnsi="Wingdings" w:hint="default"/>
+        <w:sz w:val="20"/>
+      </w:rPr>
+    </w:lvl>
+  </w:abstractNum>
+  <w:abstractNum w:abstractNumId="8" w15:restartNumberingAfterBreak="0">
+    <w:nsid w:val="3EC01CD4"/>
+    <w:multiLevelType w:val="multilevel"/>
+    <w:tmpl w:val="5FD03BAA"/>
+    <w:lvl w:ilvl="0">
+      <w:start w:val="1"/>
+      <w:numFmt w:val="bullet"/>
+      <w:lvlText w:val=""/>
+      <w:lvlJc w:val="left"/>
+      <w:pPr>
+        <w:tabs>
+          <w:tab w:val="num" w:pos="720"/>
+        </w:tabs>
+        <w:ind w:left="720" w:hanging="360"/>
+      </w:pPr>
+      <w:rPr>
+        <w:rFonts w:ascii="Symbol" w:hAnsi="Symbol" w:hint="default"/>
+        <w:sz w:val="20"/>
+      </w:rPr>
+    </w:lvl>
+    <w:lvl w:ilvl="1" w:tentative="1">
+      <w:start w:val="1"/>
+      <w:numFmt w:val="bullet"/>
+      <w:lvlText w:val="o"/>
+      <w:lvlJc w:val="left"/>
+      <w:pPr>
+        <w:tabs>
+          <w:tab w:val="num" w:pos="1440"/>
+        </w:tabs>
+        <w:ind w:left="1440" w:hanging="360"/>
+      </w:pPr>
+      <w:rPr>
+        <w:rFonts w:ascii="Courier New" w:hAnsi="Courier New" w:hint="default"/>
+        <w:sz w:val="20"/>
+      </w:rPr>
+    </w:lvl>
+    <w:lvl w:ilvl="2" w:tentative="1">
+      <w:start w:val="1"/>
+      <w:numFmt w:val="bullet"/>
+      <w:lvlText w:val=""/>
+      <w:lvlJc w:val="left"/>
+      <w:pPr>
+        <w:tabs>
+          <w:tab w:val="num" w:pos="2160"/>
+        </w:tabs>
+        <w:ind w:left="2160" w:hanging="360"/>
+      </w:pPr>
+      <w:rPr>
+        <w:rFonts w:ascii="Wingdings" w:hAnsi="Wingdings" w:hint="default"/>
+        <w:sz w:val="20"/>
+      </w:rPr>
+    </w:lvl>
+    <w:lvl w:ilvl="3" w:tentative="1">
+      <w:start w:val="1"/>
+      <w:numFmt w:val="bullet"/>
+      <w:lvlText w:val=""/>
+      <w:lvlJc w:val="left"/>
+      <w:pPr>
+        <w:tabs>
+          <w:tab w:val="num" w:pos="2880"/>
+        </w:tabs>
+        <w:ind w:left="2880" w:hanging="360"/>
+      </w:pPr>
+      <w:rPr>
+        <w:rFonts w:ascii="Wingdings" w:hAnsi="Wingdings" w:hint="default"/>
+        <w:sz w:val="20"/>
+      </w:rPr>
+    </w:lvl>
+    <w:lvl w:ilvl="4" w:tentative="1">
+      <w:start w:val="1"/>
+      <w:numFmt w:val="bullet"/>
+      <w:lvlText w:val=""/>
+      <w:lvlJc w:val="left"/>
+      <w:pPr>
+        <w:tabs>
+          <w:tab w:val="num" w:pos="3600"/>
+        </w:tabs>
+        <w:ind w:left="3600" w:hanging="360"/>
+      </w:pPr>
+      <w:rPr>
+        <w:rFonts w:ascii="Wingdings" w:hAnsi="Wingdings" w:hint="default"/>
+        <w:sz w:val="20"/>
+      </w:rPr>
+    </w:lvl>
+    <w:lvl w:ilvl="5" w:tentative="1">
+      <w:start w:val="1"/>
+      <w:numFmt w:val="bullet"/>
+      <w:lvlText w:val=""/>
+      <w:lvlJc w:val="left"/>
+      <w:pPr>
+        <w:tabs>
+          <w:tab w:val="num" w:pos="4320"/>
+        </w:tabs>
+        <w:ind w:left="4320" w:hanging="360"/>
+      </w:pPr>
+      <w:rPr>
+        <w:rFonts w:ascii="Wingdings" w:hAnsi="Wingdings" w:hint="default"/>
+        <w:sz w:val="20"/>
+      </w:rPr>
+    </w:lvl>
+    <w:lvl w:ilvl="6" w:tentative="1">
+      <w:start w:val="1"/>
+      <w:numFmt w:val="bullet"/>
+      <w:lvlText w:val=""/>
+      <w:lvlJc w:val="left"/>
+      <w:pPr>
+        <w:tabs>
+          <w:tab w:val="num" w:pos="5040"/>
+        </w:tabs>
+        <w:ind w:left="5040" w:hanging="360"/>
+      </w:pPr>
+      <w:rPr>
+        <w:rFonts w:ascii="Wingdings" w:hAnsi="Wingdings" w:hint="default"/>
+        <w:sz w:val="20"/>
+      </w:rPr>
+    </w:lvl>
+    <w:lvl w:ilvl="7" w:tentative="1">
+      <w:start w:val="1"/>
+      <w:numFmt w:val="bullet"/>
+      <w:lvlText w:val=""/>
+      <w:lvlJc w:val="left"/>
+      <w:pPr>
+        <w:tabs>
+          <w:tab w:val="num" w:pos="5760"/>
+        </w:tabs>
+        <w:ind w:left="5760" w:hanging="360"/>
+      </w:pPr>
+      <w:rPr>
+        <w:rFonts w:ascii="Wingdings" w:hAnsi="Wingdings" w:hint="default"/>
+        <w:sz w:val="20"/>
+      </w:rPr>
+    </w:lvl>
+    <w:lvl w:ilvl="8" w:tentative="1">
+      <w:start w:val="1"/>
+      <w:numFmt w:val="bullet"/>
+      <w:lvlText w:val=""/>
+      <w:lvlJc w:val="left"/>
+      <w:pPr>
+        <w:tabs>
+          <w:tab w:val="num" w:pos="6480"/>
+        </w:tabs>
+        <w:ind w:left="6480" w:hanging="360"/>
+      </w:pPr>
+      <w:rPr>
+        <w:rFonts w:ascii="Wingdings" w:hAnsi="Wingdings" w:hint="default"/>
+        <w:sz w:val="20"/>
+      </w:rPr>
+    </w:lvl>
+  </w:abstractNum>
+  <w:abstractNum w:abstractNumId="9" w15:restartNumberingAfterBreak="0">
+    <w:nsid w:val="55E151B2"/>
+    <w:multiLevelType w:val="multilevel"/>
+    <w:tmpl w:val="BCAED9F6"/>
+    <w:lvl w:ilvl="0">
+      <w:start w:val="1"/>
+      <w:numFmt w:val="bullet"/>
+      <w:lvlText w:val=""/>
+      <w:lvlJc w:val="left"/>
+      <w:pPr>
+        <w:tabs>
+          <w:tab w:val="num" w:pos="720"/>
+        </w:tabs>
+        <w:ind w:left="720" w:hanging="360"/>
+      </w:pPr>
+      <w:rPr>
+        <w:rFonts w:ascii="Symbol" w:hAnsi="Symbol" w:hint="default"/>
+        <w:sz w:val="20"/>
+      </w:rPr>
+    </w:lvl>
+    <w:lvl w:ilvl="1" w:tentative="1">
+      <w:start w:val="1"/>
+      <w:numFmt w:val="bullet"/>
+      <w:lvlText w:val="o"/>
+      <w:lvlJc w:val="left"/>
+      <w:pPr>
+        <w:tabs>
+          <w:tab w:val="num" w:pos="1440"/>
+        </w:tabs>
+        <w:ind w:left="1440" w:hanging="360"/>
+      </w:pPr>
+      <w:rPr>
+        <w:rFonts w:ascii="Courier New" w:hAnsi="Courier New" w:hint="default"/>
+        <w:sz w:val="20"/>
+      </w:rPr>
+    </w:lvl>
+    <w:lvl w:ilvl="2" w:tentative="1">
+      <w:start w:val="1"/>
+      <w:numFmt w:val="bullet"/>
+      <w:lvlText w:val=""/>
+      <w:lvlJc w:val="left"/>
+      <w:pPr>
+        <w:tabs>
+          <w:tab w:val="num" w:pos="2160"/>
+        </w:tabs>
+        <w:ind w:left="2160" w:hanging="360"/>
+      </w:pPr>
+      <w:rPr>
+        <w:rFonts w:ascii="Wingdings" w:hAnsi="Wingdings" w:hint="default"/>
+        <w:sz w:val="20"/>
+      </w:rPr>
+    </w:lvl>
+    <w:lvl w:ilvl="3" w:tentative="1">
+      <w:start w:val="1"/>
+      <w:numFmt w:val="bullet"/>
+      <w:lvlText w:val=""/>
+      <w:lvlJc w:val="left"/>
+      <w:pPr>
+        <w:tabs>
+          <w:tab w:val="num" w:pos="2880"/>
+        </w:tabs>
+        <w:ind w:left="2880" w:hanging="360"/>
+      </w:pPr>
+      <w:rPr>
+        <w:rFonts w:ascii="Wingdings" w:hAnsi="Wingdings" w:hint="default"/>
+        <w:sz w:val="20"/>
+      </w:rPr>
+    </w:lvl>
+    <w:lvl w:ilvl="4" w:tentative="1">
+      <w:start w:val="1"/>
+      <w:numFmt w:val="bullet"/>
+      <w:lvlText w:val=""/>
+      <w:lvlJc w:val="left"/>
+      <w:pPr>
+        <w:tabs>
+          <w:tab w:val="num" w:pos="3600"/>
+        </w:tabs>
+        <w:ind w:left="3600" w:hanging="360"/>
+      </w:pPr>
+      <w:rPr>
+        <w:rFonts w:ascii="Wingdings" w:hAnsi="Wingdings" w:hint="default"/>
+        <w:sz w:val="20"/>
+      </w:rPr>
+    </w:lvl>
+    <w:lvl w:ilvl="5" w:tentative="1">
+      <w:start w:val="1"/>
+      <w:numFmt w:val="bullet"/>
+      <w:lvlText w:val=""/>
+      <w:lvlJc w:val="left"/>
+      <w:pPr>
+        <w:tabs>
+          <w:tab w:val="num" w:pos="4320"/>
+        </w:tabs>
+        <w:ind w:left="4320" w:hanging="360"/>
+      </w:pPr>
+      <w:rPr>
+        <w:rFonts w:ascii="Wingdings" w:hAnsi="Wingdings" w:hint="default"/>
+        <w:sz w:val="20"/>
+      </w:rPr>
+    </w:lvl>
+    <w:lvl w:ilvl="6" w:tentative="1">
+      <w:start w:val="1"/>
+      <w:numFmt w:val="bullet"/>
+      <w:lvlText w:val=""/>
+      <w:lvlJc w:val="left"/>
+      <w:pPr>
+        <w:tabs>
+          <w:tab w:val="num" w:pos="5040"/>
+        </w:tabs>
+        <w:ind w:left="5040" w:hanging="360"/>
+      </w:pPr>
+      <w:rPr>
+        <w:rFonts w:ascii="Wingdings" w:hAnsi="Wingdings" w:hint="default"/>
+        <w:sz w:val="20"/>
+      </w:rPr>
+    </w:lvl>
+    <w:lvl w:ilvl="7" w:tentative="1">
+      <w:start w:val="1"/>
+      <w:numFmt w:val="bullet"/>
+      <w:lvlText w:val=""/>
+      <w:lvlJc w:val="left"/>
+      <w:pPr>
+        <w:tabs>
+          <w:tab w:val="num" w:pos="5760"/>
+        </w:tabs>
+        <w:ind w:left="5760" w:hanging="360"/>
+      </w:pPr>
+      <w:rPr>
+        <w:rFonts w:ascii="Wingdings" w:hAnsi="Wingdings" w:hint="default"/>
+        <w:sz w:val="20"/>
+      </w:rPr>
+    </w:lvl>
+    <w:lvl w:ilvl="8" w:tentative="1">
+      <w:start w:val="1"/>
+      <w:numFmt w:val="bullet"/>
+      <w:lvlText w:val=""/>
+      <w:lvlJc w:val="left"/>
+      <w:pPr>
+        <w:tabs>
+          <w:tab w:val="num" w:pos="6480"/>
+        </w:tabs>
+        <w:ind w:left="6480" w:hanging="360"/>
+      </w:pPr>
+      <w:rPr>
+        <w:rFonts w:ascii="Wingdings" w:hAnsi="Wingdings" w:hint="default"/>
+        <w:sz w:val="20"/>
+      </w:rPr>
+    </w:lvl>
+  </w:abstractNum>
+  <w:abstractNum w:abstractNumId="10" w15:restartNumberingAfterBreak="0">
+    <w:nsid w:val="627732FE"/>
+    <w:multiLevelType w:val="multilevel"/>
+    <w:tmpl w:val="D34EED54"/>
+    <w:lvl w:ilvl="0">
+      <w:start w:val="1"/>
+      <w:numFmt w:val="decimal"/>
+      <w:lvlText w:val="%1."/>
+      <w:lvlJc w:val="left"/>
+      <w:pPr>
+        <w:tabs>
+          <w:tab w:val="num" w:pos="720"/>
+        </w:tabs>
+        <w:ind w:left="720" w:hanging="360"/>
+      </w:pPr>
+    </w:lvl>
+    <w:lvl w:ilvl="1" w:tentative="1">
+      <w:start w:val="1"/>
+      <w:numFmt w:val="decimal"/>
+      <w:lvlText w:val="%2."/>
+      <w:lvlJc w:val="left"/>
+      <w:pPr>
+        <w:tabs>
+          <w:tab w:val="num" w:pos="1440"/>
+        </w:tabs>
+        <w:ind w:left="1440" w:hanging="360"/>
+      </w:pPr>
+    </w:lvl>
+    <w:lvl w:ilvl="2" w:tentative="1">
+      <w:start w:val="1"/>
+      <w:numFmt w:val="decimal"/>
+      <w:lvlText w:val="%3."/>
+      <w:lvlJc w:val="left"/>
+      <w:pPr>
+        <w:tabs>
+          <w:tab w:val="num" w:pos="2160"/>
+        </w:tabs>
+        <w:ind w:left="2160" w:hanging="360"/>
+      </w:pPr>
+    </w:lvl>
+    <w:lvl w:ilvl="3" w:tentative="1">
+      <w:start w:val="1"/>
+      <w:numFmt w:val="decimal"/>
+      <w:lvlText w:val="%4."/>
+      <w:lvlJc w:val="left"/>
+      <w:pPr>
+        <w:tabs>
+          <w:tab w:val="num" w:pos="2880"/>
+        </w:tabs>
+        <w:ind w:left="2880" w:hanging="360"/>
+      </w:pPr>
+    </w:lvl>
+    <w:lvl w:ilvl="4" w:tentative="1">
+      <w:start w:val="1"/>
+      <w:numFmt w:val="decimal"/>
+      <w:lvlText w:val="%5."/>
+      <w:lvlJc w:val="left"/>
+      <w:pPr>
+        <w:tabs>
+          <w:tab w:val="num" w:pos="3600"/>
+        </w:tabs>
+        <w:ind w:left="3600" w:hanging="360"/>
+      </w:pPr>
+    </w:lvl>
+    <w:lvl w:ilvl="5" w:tentative="1">
+      <w:start w:val="1"/>
+      <w:numFmt w:val="decimal"/>
+      <w:lvlText w:val="%6."/>
+      <w:lvlJc w:val="left"/>
+      <w:pPr>
+        <w:tabs>
+          <w:tab w:val="num" w:pos="4320"/>
+        </w:tabs>
+        <w:ind w:left="4320" w:hanging="360"/>
+      </w:pPr>
+    </w:lvl>
+    <w:lvl w:ilvl="6" w:tentative="1">
+      <w:start w:val="1"/>
+      <w:numFmt w:val="decimal"/>
+      <w:lvlText w:val="%7."/>
+      <w:lvlJc w:val="left"/>
+      <w:pPr>
+        <w:tabs>
+          <w:tab w:val="num" w:pos="5040"/>
+        </w:tabs>
+        <w:ind w:left="5040" w:hanging="360"/>
+      </w:pPr>
+    </w:lvl>
+    <w:lvl w:ilvl="7" w:tentative="1">
+      <w:start w:val="1"/>
+      <w:numFmt w:val="decimal"/>
+      <w:lvlText w:val="%8."/>
+      <w:lvlJc w:val="left"/>
+      <w:pPr>
+        <w:tabs>
+          <w:tab w:val="num" w:pos="5760"/>
+        </w:tabs>
+        <w:ind w:left="5760" w:hanging="360"/>
+      </w:pPr>
+    </w:lvl>
+    <w:lvl w:ilvl="8" w:tentative="1">
+      <w:start w:val="1"/>
+      <w:numFmt w:val="decimal"/>
+      <w:lvlText w:val="%9."/>
+      <w:lvlJc w:val="left"/>
+      <w:pPr>
+        <w:tabs>
+          <w:tab w:val="num" w:pos="6480"/>
+        </w:tabs>
+        <w:ind w:left="6480" w:hanging="360"/>
+      </w:pPr>
+    </w:lvl>
+  </w:abstractNum>
+  <w:abstractNum w:abstractNumId="11" w15:restartNumberingAfterBreak="0">
+    <w:nsid w:val="72FD21D7"/>
+    <w:multiLevelType w:val="multilevel"/>
+    <w:tmpl w:val="E9EC850E"/>
+    <w:lvl w:ilvl="0">
+      <w:start w:val="1"/>
+      <w:numFmt w:val="bullet"/>
+      <w:lvlText w:val=""/>
+      <w:lvlJc w:val="left"/>
+      <w:pPr>
+        <w:tabs>
+          <w:tab w:val="num" w:pos="720"/>
+        </w:tabs>
+        <w:ind w:left="720" w:hanging="360"/>
+      </w:pPr>
+      <w:rPr>
+        <w:rFonts w:ascii="Symbol" w:hAnsi="Symbol" w:hint="default"/>
+        <w:sz w:val="20"/>
+      </w:rPr>
+    </w:lvl>
+    <w:lvl w:ilvl="1" w:tentative="1">
+      <w:start w:val="1"/>
+      <w:numFmt w:val="bullet"/>
+      <w:lvlText w:val="o"/>
+      <w:lvlJc w:val="left"/>
+      <w:pPr>
+        <w:tabs>
+          <w:tab w:val="num" w:pos="1440"/>
+        </w:tabs>
+        <w:ind w:left="1440" w:hanging="360"/>
+      </w:pPr>
+      <w:rPr>
+        <w:rFonts w:ascii="Courier New" w:hAnsi="Courier New" w:hint="default"/>
+        <w:sz w:val="20"/>
+      </w:rPr>
+    </w:lvl>
+    <w:lvl w:ilvl="2" w:tentative="1">
+      <w:start w:val="1"/>
+      <w:numFmt w:val="bullet"/>
+      <w:lvlText w:val=""/>
+      <w:lvlJc w:val="left"/>
+      <w:pPr>
+        <w:tabs>
+          <w:tab w:val="num" w:pos="2160"/>
+        </w:tabs>
+        <w:ind w:left="2160" w:hanging="360"/>
+      </w:pPr>
+      <w:rPr>
+        <w:rFonts w:ascii="Wingdings" w:hAnsi="Wingdings" w:hint="default"/>
+        <w:sz w:val="20"/>
+      </w:rPr>
+    </w:lvl>
+    <w:lvl w:ilvl="3" w:tentative="1">
+      <w:start w:val="1"/>
+      <w:numFmt w:val="bullet"/>
+      <w:lvlText w:val=""/>
+      <w:lvlJc w:val="left"/>
+      <w:pPr>
+        <w:tabs>
+          <w:tab w:val="num" w:pos="2880"/>
+        </w:tabs>
+        <w:ind w:left="2880" w:hanging="360"/>
+      </w:pPr>
+      <w:rPr>
+        <w:rFonts w:ascii="Wingdings" w:hAnsi="Wingdings" w:hint="default"/>
+        <w:sz w:val="20"/>
+      </w:rPr>
+    </w:lvl>
+    <w:lvl w:ilvl="4" w:tentative="1">
+      <w:start w:val="1"/>
+      <w:numFmt w:val="bullet"/>
+      <w:lvlText w:val=""/>
+      <w:lvlJc w:val="left"/>
+      <w:pPr>
+        <w:tabs>
+          <w:tab w:val="num" w:pos="3600"/>
+        </w:tabs>
+        <w:ind w:left="3600" w:hanging="360"/>
+      </w:pPr>
+      <w:rPr>
+        <w:rFonts w:ascii="Wingdings" w:hAnsi="Wingdings" w:hint="default"/>
+        <w:sz w:val="20"/>
+      </w:rPr>
+    </w:lvl>
+    <w:lvl w:ilvl="5" w:tentative="1">
+      <w:start w:val="1"/>
+      <w:numFmt w:val="bullet"/>
+      <w:lvlText w:val=""/>
+      <w:lvlJc w:val="left"/>
+      <w:pPr>
+        <w:tabs>
+          <w:tab w:val="num" w:pos="4320"/>
+        </w:tabs>
+        <w:ind w:left="4320" w:hanging="360"/>
+      </w:pPr>
+      <w:rPr>
+        <w:rFonts w:ascii="Wingdings" w:hAnsi="Wingdings" w:hint="default"/>
+        <w:sz w:val="20"/>
+      </w:rPr>
+    </w:lvl>
+    <w:lvl w:ilvl="6" w:tentative="1">
+      <w:start w:val="1"/>
+      <w:numFmt w:val="bullet"/>
+      <w:lvlText w:val=""/>
+      <w:lvlJc w:val="left"/>
+      <w:pPr>
+        <w:tabs>
+          <w:tab w:val="num" w:pos="5040"/>
+        </w:tabs>
+        <w:ind w:left="5040" w:hanging="360"/>
+      </w:pPr>
+      <w:rPr>
+        <w:rFonts w:ascii="Wingdings" w:hAnsi="Wingdings" w:hint="default"/>
+        <w:sz w:val="20"/>
+      </w:rPr>
+    </w:lvl>
+    <w:lvl w:ilvl="7" w:tentative="1">
+      <w:start w:val="1"/>
+      <w:numFmt w:val="bullet"/>
+      <w:lvlText w:val=""/>
+      <w:lvlJc w:val="left"/>
+      <w:pPr>
+        <w:tabs>
+          <w:tab w:val="num" w:pos="5760"/>
+        </w:tabs>
+        <w:ind w:left="5760" w:hanging="360"/>
+      </w:pPr>
+      <w:rPr>
+        <w:rFonts w:ascii="Wingdings" w:hAnsi="Wingdings" w:hint="default"/>
+        <w:sz w:val="20"/>
+      </w:rPr>
+    </w:lvl>
+    <w:lvl w:ilvl="8" w:tentative="1">
+      <w:start w:val="1"/>
+      <w:numFmt w:val="bullet"/>
+      <w:lvlText w:val=""/>
+      <w:lvlJc w:val="left"/>
+      <w:pPr>
+        <w:tabs>
+          <w:tab w:val="num" w:pos="6480"/>
+        </w:tabs>
+        <w:ind w:left="6480" w:hanging="360"/>
+      </w:pPr>
+      <w:rPr>
+        <w:rFonts w:ascii="Wingdings" w:hAnsi="Wingdings" w:hint="default"/>
+        <w:sz w:val="20"/>
+      </w:rPr>
+    </w:lvl>
+  </w:abstractNum>
   <w:num w:numId="1" w16cid:durableId="1765228655">
+    <w:abstractNumId w:val="4"/>
+  </w:num>
+  <w:num w:numId="2" w16cid:durableId="1254625426">
+    <w:abstractNumId w:val="5"/>
+  </w:num>
+  <w:num w:numId="3" w16cid:durableId="664210722">
+    <w:abstractNumId w:val="10"/>
+  </w:num>
+  <w:num w:numId="4" w16cid:durableId="37824852">
+    <w:abstractNumId w:val="2"/>
+  </w:num>
+  <w:num w:numId="5" w16cid:durableId="945885310">
+    <w:abstractNumId w:val="7"/>
+  </w:num>
+  <w:num w:numId="6" w16cid:durableId="1519856524">
+    <w:abstractNumId w:val="1"/>
+  </w:num>
+  <w:num w:numId="7" w16cid:durableId="1403527071">
+    <w:abstractNumId w:val="6"/>
+  </w:num>
+  <w:num w:numId="8" w16cid:durableId="679357877">
+    <w:abstractNumId w:val="9"/>
+  </w:num>
+  <w:num w:numId="9" w16cid:durableId="1710763399">
+    <w:abstractNumId w:val="11"/>
+  </w:num>
+  <w:num w:numId="10" w16cid:durableId="998076049">
+    <w:abstractNumId w:val="8"/>
+  </w:num>
+  <w:num w:numId="11" w16cid:durableId="1468276307">
     <w:abstractNumId w:val="0"/>
+  </w:num>
+  <w:num w:numId="12" w16cid:durableId="74130569">
+    <w:abstractNumId w:val="3"/>
   </w:num>
 </w:numbering>
 </file>

</xml_diff>